<commit_message>
feat: integrate live leetcode stats, monthly heatmap, and refine End dimension Ui
</commit_message>
<xml_diff>
--- a/portfolio/static/files/mycv.docx
+++ b/portfolio/static/files/mycv.docx
@@ -2765,7 +2765,7 @@
           <w:sz w:val="20"/>
           <w:szCs w:val="20"/>
         </w:rPr>
-        <w:t xml:space="preserve"> 1</w:t>
+        <w:t xml:space="preserve"> </w:t>
       </w:r>
       <w:r>
         <w:rPr>
@@ -2776,7 +2776,7 @@
           <w:sz w:val="20"/>
           <w:szCs w:val="20"/>
         </w:rPr>
-        <w:t>5</w:t>
+        <w:t>200</w:t>
       </w:r>
       <w:r>
         <w:rPr>
@@ -2787,7 +2787,7 @@
           <w:sz w:val="20"/>
           <w:szCs w:val="20"/>
         </w:rPr>
-        <w:t>0 problems in Leet Code</w:t>
+        <w:t xml:space="preserve"> problems in Leet Code</w:t>
       </w:r>
     </w:p>
     <w:p>
@@ -3476,7 +3476,6 @@
           </mc:Fallback>
         </mc:AlternateContent>
       </w:r>
-      <w:proofErr w:type="spellStart"/>
       <w:r>
         <w:rPr>
           <w:rFonts w:ascii="Arial" w:hAnsi="Arial" w:cs="Arial"/>
@@ -3485,9 +3484,8 @@
           <w:sz w:val="20"/>
           <w:szCs w:val="20"/>
         </w:rPr>
-        <w:t>Sainik</w:t>
-      </w:r>
-      <w:proofErr w:type="spellEnd"/>
+        <w:t>Sainik School Ambikapur</w:t>
+      </w:r>
       <w:r>
         <w:rPr>
           <w:rFonts w:ascii="Arial" w:hAnsi="Arial" w:cs="Arial"/>
@@ -3496,7 +3494,7 @@
           <w:sz w:val="20"/>
           <w:szCs w:val="20"/>
         </w:rPr>
-        <w:t xml:space="preserve"> School Ambikapur</w:t>
+        <w:tab/>
       </w:r>
       <w:r>
         <w:rPr>
@@ -3506,19 +3504,8 @@
           <w:sz w:val="20"/>
           <w:szCs w:val="20"/>
         </w:rPr>
-        <w:tab/>
-      </w:r>
-      <w:r>
-        <w:rPr>
-          <w:rFonts w:ascii="Arial" w:hAnsi="Arial" w:cs="Arial"/>
-          <w:b/>
-          <w:color w:val="2E3092"/>
-          <w:sz w:val="20"/>
-          <w:szCs w:val="20"/>
-        </w:rPr>
         <w:t xml:space="preserve">             </w:t>
       </w:r>
-      <w:proofErr w:type="spellStart"/>
       <w:r>
         <w:rPr>
           <w:rFonts w:ascii="Arial" w:hAnsi="Arial" w:cs="Arial"/>
@@ -3526,17 +3513,7 @@
           <w:sz w:val="20"/>
           <w:szCs w:val="20"/>
         </w:rPr>
-        <w:t>Ambikapur</w:t>
-      </w:r>
-      <w:proofErr w:type="spellEnd"/>
-      <w:r>
-        <w:rPr>
-          <w:rFonts w:ascii="Arial" w:hAnsi="Arial" w:cs="Arial"/>
-          <w:w w:val="95"/>
-          <w:sz w:val="20"/>
-          <w:szCs w:val="20"/>
-        </w:rPr>
-        <w:t xml:space="preserve"> ,C.G</w:t>
+        <w:t>Ambikapur ,C.G</w:t>
       </w:r>
     </w:p>
     <w:p>
@@ -3842,7 +3819,6 @@
           </mc:Fallback>
         </mc:AlternateContent>
       </w:r>
-      <w:proofErr w:type="spellStart"/>
       <w:r>
         <w:rPr>
           <w:rFonts w:ascii="Arial" w:hAnsi="Arial" w:cs="Arial"/>
@@ -3852,19 +3828,17 @@
           <w:sz w:val="20"/>
           <w:szCs w:val="20"/>
         </w:rPr>
-        <w:t>Sainik</w:t>
-      </w:r>
-      <w:proofErr w:type="spellEnd"/>
+        <w:t>Sainik School Ambikapur</w:t>
+      </w:r>
       <w:r>
         <w:rPr>
           <w:rFonts w:ascii="Arial" w:hAnsi="Arial" w:cs="Arial"/>
           <w:b/>
           <w:color w:val="2E3092"/>
-          <w:spacing w:val="-1"/>
-          <w:sz w:val="20"/>
-          <w:szCs w:val="20"/>
-        </w:rPr>
-        <w:t xml:space="preserve"> School Ambikapur</w:t>
+          <w:sz w:val="20"/>
+          <w:szCs w:val="20"/>
+        </w:rPr>
+        <w:tab/>
       </w:r>
       <w:r>
         <w:rPr>
@@ -3874,35 +3848,15 @@
           <w:sz w:val="20"/>
           <w:szCs w:val="20"/>
         </w:rPr>
-        <w:tab/>
-      </w:r>
-      <w:r>
-        <w:rPr>
-          <w:rFonts w:ascii="Arial" w:hAnsi="Arial" w:cs="Arial"/>
-          <w:b/>
-          <w:color w:val="2E3092"/>
-          <w:sz w:val="20"/>
-          <w:szCs w:val="20"/>
-        </w:rPr>
         <w:t xml:space="preserve">         </w:t>
       </w:r>
-      <w:proofErr w:type="spellStart"/>
-      <w:r>
-        <w:rPr>
-          <w:rFonts w:ascii="Arial" w:hAnsi="Arial" w:cs="Arial"/>
-          <w:sz w:val="20"/>
-          <w:szCs w:val="20"/>
-        </w:rPr>
-        <w:t>Ambikapur</w:t>
-      </w:r>
-      <w:proofErr w:type="spellEnd"/>
-      <w:r>
-        <w:rPr>
-          <w:rFonts w:ascii="Arial" w:hAnsi="Arial" w:cs="Arial"/>
-          <w:sz w:val="20"/>
-          <w:szCs w:val="20"/>
-        </w:rPr>
-        <w:t>, C.G</w:t>
+      <w:r>
+        <w:rPr>
+          <w:rFonts w:ascii="Arial" w:hAnsi="Arial" w:cs="Arial"/>
+          <w:sz w:val="20"/>
+          <w:szCs w:val="20"/>
+        </w:rPr>
+        <w:t>Ambikapur, C.G</w:t>
       </w:r>
     </w:p>
     <w:p>

</xml_diff>